<commit_message>
Add the lab landing page and remove the submission checklist
- index.html and viewer.html in the same style as Week 04, with links
  to the lab PDF, the code zip and the Code folder on GitHub
- The lab document now ends after Task 3 (no submission checklist)

Co-Authored-By: Claude Opus 5.5 <noreply@anthropic.com>
Claude-Session: https://claude.ai/code/session_019bn29Dctnrxygk9jssTUQw
</commit_message>
<xml_diff>
--- a/W05 LAB UART Communication and Data Integrity.docx
+++ b/W05 LAB UART Communication and Data Integrity.docx
@@ -6309,64 +6309,6 @@
         </w:tc>
       </w:tr>
     </w:tbl>
-    <w:p>
-      <w:pPr>
-        <w:spacing w:after="0" w:line="264" w:lineRule="auto"/>
-      </w:pPr>
-    </w:p>
-    <w:p>
-      <w:pPr>
-        <w:pStyle w:val="Heading1"/>
-        <w:keepNext/>
-        <w:spacing w:before="360" w:after="120"/>
-      </w:pPr>
-      <w:r>
-        <w:rPr>
-          <w:b/>
-          <w:bCs/>
-        </w:rPr>
-        <w:t xml:space="preserve">5  Submission checklist</w:t>
-      </w:r>
-    </w:p>
-    <w:p>
-      <w:pPr>
-        <w:pStyle w:val="ListParagraph"/>
-        <w:numPr>
-          <w:ilvl w:val="0"/>
-          <w:numId w:val="1"/>
-        </w:numPr>
-        <w:spacing w:after="60" w:line="264" w:lineRule="auto"/>
-      </w:pPr>
-      <w:r>
-        <w:t xml:space="preserve">Task 1: LCD photo and answers to 1b, 1c and 1d.</w:t>
-      </w:r>
-    </w:p>
-    <w:p>
-      <w:pPr>
-        <w:pStyle w:val="ListParagraph"/>
-        <w:numPr>
-          <w:ilvl w:val="0"/>
-          <w:numId w:val="1"/>
-        </w:numPr>
-        <w:spacing w:after="60" w:line="264" w:lineRule="auto"/>
-      </w:pPr>
-      <w:r>
-        <w:t xml:space="preserve">Task 2: Serial Monitor output from both boards, the completed “break it” table, and answers to 2c.</w:t>
-      </w:r>
-    </w:p>
-    <w:p>
-      <w:pPr>
-        <w:pStyle w:val="ListParagraph"/>
-        <w:numPr>
-          <w:ilvl w:val="0"/>
-          <w:numId w:val="1"/>
-        </w:numPr>
-        <w:spacing w:after="60" w:line="264" w:lineRule="auto"/>
-      </w:pPr>
-      <w:r>
-        <w:t xml:space="preserve">Task 3: Serial Monitor output from both boards, and answers to 3b, 3c and 3d.</w:t>
-      </w:r>
-    </w:p>
     <w:sectPr>
       <w:headerReference w:type="default" r:id="rId14"/>
       <w:footerReference w:type="default" r:id="rId15"/>

</xml_diff>

<commit_message>
Add Task 4: checking messages with SHA-1
- Task4_Sender / Task4_Receiver for both displays, with the SHA-1
  function at the bottom of each sketch and a tamper button on D2
- Lab document gains a short Task 4 in the same format as the other
  tasks: what a hash is, what happens, and a few questions

Co-Authored-By: Claude Opus 5.5 <noreply@anthropic.com>
Claude-Session: https://claude.ai/code/session_019bn29Dctnrxygk9jssTUQw
</commit_message>
<xml_diff>
--- a/W05 LAB UART Communication and Data Integrity.docx
+++ b/W05 LAB UART Communication and Data Integrity.docx
@@ -688,6 +688,80 @@
                 <w:szCs w:val="19"/>
               </w:rPr>
               <w:t>One per board.</w:t>
+            </w:r>
+          </w:p>
+        </w:tc>
+      </w:tr>
+      <w:tr>
+        <w:trPr>
+          <w:cantSplit/>
+        </w:trPr>
+        <w:tc>
+          <w:tcPr>
+            <w:tcW w:w="4400" w:type="dxa"/>
+            <w:tcMar>
+              <w:top w:w="60" w:type="dxa"/>
+              <w:left w:w="100" w:type="dxa"/>
+              <w:bottom w:w="60" w:type="dxa"/>
+              <w:right w:w="100" w:type="dxa"/>
+            </w:tcMar>
+          </w:tcPr>
+          <w:p>
+            <w:pPr>
+              <w:spacing w:line="264" w:lineRule="auto"/>
+            </w:pPr>
+            <w:r>
+              <w:rPr>
+                <w:sz w:val="19"/>
+                <w:szCs w:val="19"/>
+              </w:rPr>
+              <w:t>Push button</w:t>
+            </w:r>
+          </w:p>
+        </w:tc>
+        <w:tc>
+          <w:tcPr>
+            <w:tcW w:w="900" w:type="dxa"/>
+            <w:tcMar>
+              <w:top w:w="60" w:type="dxa"/>
+              <w:left w:w="100" w:type="dxa"/>
+              <w:bottom w:w="60" w:type="dxa"/>
+              <w:right w:w="100" w:type="dxa"/>
+            </w:tcMar>
+          </w:tcPr>
+          <w:p>
+            <w:pPr>
+              <w:spacing w:line="264" w:lineRule="auto"/>
+            </w:pPr>
+            <w:r>
+              <w:rPr>
+                <w:sz w:val="19"/>
+                <w:szCs w:val="19"/>
+              </w:rPr>
+              <w:t>1</w:t>
+            </w:r>
+          </w:p>
+        </w:tc>
+        <w:tc>
+          <w:tcPr>
+            <w:tcW w:w="4406" w:type="dxa"/>
+            <w:tcMar>
+              <w:top w:w="60" w:type="dxa"/>
+              <w:left w:w="100" w:type="dxa"/>
+              <w:bottom w:w="60" w:type="dxa"/>
+              <w:right w:w="100" w:type="dxa"/>
+            </w:tcMar>
+          </w:tcPr>
+          <w:p>
+            <w:pPr>
+              <w:spacing w:line="264" w:lineRule="auto"/>
+            </w:pPr>
+            <w:r>
+              <w:rPr>
+                <w:sz w:val="19"/>
+                <w:szCs w:val="19"/>
+              </w:rPr>
+              <w:t>Task 4 only.</w:t>
             </w:r>
           </w:p>
         </w:tc>
@@ -6244,6 +6318,1295 @@
       </w:pPr>
       <w:r>
         <w:t xml:space="preserve">3. Why is a Caesar cipher not used to protect real data?</w:t>
+      </w:r>
+    </w:p>
+    <w:tbl>
+      <w:tblPr>
+        <w:tblW w:w="9706" w:type="dxa"/>
+        <w:tblBorders>
+          <w:top w:val="single" w:sz="4" w:space="0" w:color="A6A6A6"/>
+          <w:left w:val="single" w:sz="4" w:space="0" w:color="A6A6A6"/>
+          <w:bottom w:val="single" w:sz="4" w:space="0" w:color="A6A6A6"/>
+          <w:right w:val="single" w:sz="4" w:space="0" w:color="A6A6A6"/>
+        </w:tblBorders>
+        <w:tblLayout w:type="fixed"/>
+        <w:tblLook w:val="04A0" w:firstRow="1" w:lastRow="0" w:firstColumn="1" w:lastColumn="0" w:noHBand="0" w:noVBand="1"/>
+      </w:tblPr>
+      <w:tblGrid>
+        <w:gridCol w:w="9706"/>
+      </w:tblGrid>
+      <w:tr>
+        <w:trPr>
+          <w:cantSplit/>
+        </w:trPr>
+        <w:tc>
+          <w:tcPr>
+            <w:tcW w:w="9706" w:type="dxa"/>
+            <w:tcMar>
+              <w:top w:w="60" w:type="dxa"/>
+              <w:left w:w="120" w:type="dxa"/>
+              <w:bottom w:w="60" w:type="dxa"/>
+              <w:right w:w="120" w:type="dxa"/>
+            </w:tcMar>
+          </w:tcPr>
+          <w:p>
+            <w:pPr>
+              <w:spacing w:line="264" w:lineRule="auto"/>
+            </w:pPr>
+            <w:r>
+              <w:rPr>
+                <w:i/>
+                <w:iCs/>
+                <w:color w:val="7F7F7F"/>
+                <w:sz w:val="18"/>
+                <w:szCs w:val="18"/>
+              </w:rPr>
+              <w:lastRenderedPageBreak/>
+              <w:t>Your answer:</w:t>
+            </w:r>
+          </w:p>
+          <w:p>
+            <w:pPr>
+              <w:spacing w:after="200" w:line="264" w:lineRule="auto"/>
+            </w:pPr>
+          </w:p>
+          <w:p>
+            <w:pPr>
+              <w:spacing w:after="200" w:line="264" w:lineRule="auto"/>
+            </w:pPr>
+          </w:p>
+          <w:p>
+            <w:pPr>
+              <w:spacing w:after="200" w:line="264" w:lineRule="auto"/>
+            </w:pPr>
+          </w:p>
+        </w:tc>
+      </w:tr>
+    </w:tbl>
+    <w:p>
+      <w:pPr>
+        <w:spacing w:after="0" w:line="264" w:lineRule="auto"/>
+      </w:pPr>
+    </w:p>
+    <w:p>
+      <w:pPr>
+        <w:pStyle w:val="Heading1"/>
+        <w:keepNext/>
+        <w:spacing w:before="360" w:after="120"/>
+      </w:pPr>
+      <w:r>
+        <w:rPr>
+          <w:b/>
+          <w:bCs/>
+        </w:rPr>
+        <w:t xml:space="preserve">5  Task 4: Checking messages with SHA-1</w:t>
+      </w:r>
+    </w:p>
+    <w:p>
+      <w:pPr>
+        <w:spacing w:after="120" w:line="264" w:lineRule="auto"/>
+      </w:pPr>
+      <w:r>
+        <w:rPr>
+          <w:b/>
+          <w:bCs/>
+        </w:rPr>
+        <w:t xml:space="preserve">Objective:</w:t>
+      </w:r>
+      <w:r>
+        <w:t xml:space="preserve"> noise or a loose wire can change bits on the way, and UART does not notice. In this task Board A sends a </w:t>
+      </w:r>
+      <w:r>
+        <w:rPr>
+          <w:b/>
+          <w:bCs/>
+        </w:rPr>
+        <w:t xml:space="preserve">hash</w:t>
+      </w:r>
+      <w:r>
+        <w:t xml:space="preserve"> with every message, and Board B uses it to check whether the message arrived unchanged. The wiring is the same as Task 2, plus a push button on Board A that damages a message on purpose.</w:t>
+      </w:r>
+    </w:p>
+    <w:tbl>
+      <w:tblPr>
+        <w:tblW w:w="9706" w:type="dxa"/>
+        <w:tblLayout w:type="fixed"/>
+        <w:tblLook w:val="04A0" w:firstRow="1" w:lastRow="0" w:firstColumn="1" w:lastColumn="0" w:noHBand="0" w:noVBand="1"/>
+      </w:tblPr>
+      <w:tblGrid>
+        <w:gridCol w:w="9706"/>
+      </w:tblGrid>
+      <w:tr>
+        <w:trPr>
+          <w:cantSplit/>
+        </w:trPr>
+        <w:tc>
+          <w:tcPr>
+            <w:tcW w:w="9706" w:type="dxa"/>
+            <w:tcMar>
+              <w:top w:w="60" w:type="dxa"/>
+              <w:left w:w="100" w:type="dxa"/>
+              <w:bottom w:w="60" w:type="dxa"/>
+              <w:right w:w="100" w:type="dxa"/>
+            </w:tcMar>
+            <w:vAlign w:val="bottom"/>
+          </w:tcPr>
+          <w:p>
+            <w:pPr>
+              <w:spacing w:after="40" w:line="264" w:lineRule="auto"/>
+              <w:jc w:val="center"/>
+            </w:pPr>
+            <w:r>
+              <w:rPr>
+                <w:noProof/>
+              </w:rPr>
+              <w:lastRenderedPageBreak/>
+              <w:drawing>
+                <wp:inline distT="0" distB="0" distL="0" distR="0" wp14:anchorId="54A1C49B" wp14:editId="5D004F00">
+                  <wp:extent cx="6120000" cy="3177692"/>
+                  <wp:effectExtent l="0" t="0" r="0" b="0"/>
+                  <wp:docPr id="507" name="Figure 7"/>
+                  <wp:cNvGraphicFramePr>
+                    <a:graphicFrameLocks xmlns:a="http://schemas.openxmlformats.org/drawingml/2006/main" noChangeAspect="1"/>
+                  </wp:cNvGraphicFramePr>
+                  <a:graphic xmlns:a="http://schemas.openxmlformats.org/drawingml/2006/main">
+                    <a:graphicData uri="http://schemas.openxmlformats.org/drawingml/2006/picture">
+                      <pic:pic xmlns:pic="http://schemas.openxmlformats.org/drawingml/2006/picture">
+                        <pic:nvPicPr>
+                          <pic:cNvPr id="507" name="fig7.png"/>
+                          <pic:cNvPicPr/>
+                        </pic:nvPicPr>
+                        <pic:blipFill>
+                          <a:blip r:embed="rId13"/>
+                          <a:stretch>
+                            <a:fillRect/>
+                          </a:stretch>
+                        </pic:blipFill>
+                        <pic:spPr>
+                          <a:xfrm>
+                            <a:off x="0" y="0"/>
+                            <a:ext cx="6120000" cy="3177692"/>
+                          </a:xfrm>
+                          <a:prstGeom prst="rect">
+                            <a:avLst/>
+                          </a:prstGeom>
+                        </pic:spPr>
+                      </pic:pic>
+                    </a:graphicData>
+                  </a:graphic>
+                </wp:inline>
+              </w:drawing>
+            </w:r>
+          </w:p>
+          <w:p>
+            <w:pPr>
+              <w:spacing w:line="264" w:lineRule="auto"/>
+              <w:jc w:val="center"/>
+            </w:pPr>
+            <w:r>
+              <w:rPr>
+                <w:b/>
+                <w:bCs/>
+                <w:color w:val="595959"/>
+                <w:sz w:val="18"/>
+                <w:szCs w:val="18"/>
+              </w:rPr>
+              <w:t xml:space="preserve">Figure 7: </w:t>
+            </w:r>
+            <w:r>
+              <w:rPr>
+                <w:color w:val="595959"/>
+                <w:sz w:val="18"/>
+                <w:szCs w:val="18"/>
+              </w:rPr>
+              <w:t>Task 4 wiring: the Task 2 link, plus a push button between Board A D2 and GND</w:t>
+            </w:r>
+          </w:p>
+        </w:tc>
+      </w:tr>
+    </w:tbl>
+    <w:p>
+      <w:pPr>
+        <w:spacing w:after="0" w:line="264" w:lineRule="auto"/>
+      </w:pPr>
+    </w:p>
+    <w:p>
+      <w:pPr>
+        <w:pStyle w:val="Heading2"/>
+        <w:keepNext/>
+        <w:spacing w:before="240" w:after="80"/>
+      </w:pPr>
+      <w:r>
+        <w:rPr>
+          <w:b/>
+          <w:bCs/>
+        </w:rPr>
+        <w:t>What is a hash?</w:t>
+      </w:r>
+    </w:p>
+    <w:p>
+      <w:pPr>
+        <w:spacing w:after="120" w:line="264" w:lineRule="auto"/>
+      </w:pPr>
+      <w:r>
+        <w:t xml:space="preserve">A hash function turns any message into a short, fixed-size “fingerprint”. SHA-1 always gives 40 hexadecimal characters. The same message always gives the same hash, but changing even one letter gives a completely different one:</w:t>
+      </w:r>
+    </w:p>
+    <w:tbl>
+      <w:tblPr>
+        <w:tblW w:w="9706" w:type="dxa"/>
+        <w:tblBorders>
+          <w:top w:val="single" w:sz="4" w:space="0" w:color="BFBFBF"/>
+          <w:left w:val="single" w:sz="4" w:space="0" w:color="BFBFBF"/>
+          <w:bottom w:val="single" w:sz="4" w:space="0" w:color="BFBFBF"/>
+          <w:right w:val="single" w:sz="4" w:space="0" w:color="BFBFBF"/>
+          <w:insideH w:val="single" w:sz="4" w:space="0" w:color="BFBFBF"/>
+          <w:insideV w:val="single" w:sz="4" w:space="0" w:color="BFBFBF"/>
+        </w:tblBorders>
+        <w:tblLayout w:type="fixed"/>
+        <w:tblLook w:val="04A0" w:firstRow="1" w:lastRow="0" w:firstColumn="1" w:lastColumn="0" w:noHBand="0" w:noVBand="1"/>
+      </w:tblPr>
+      <w:tblGrid>
+        <w:gridCol w:w="1800"/>
+        <w:gridCol w:w="7906"/>
+      </w:tblGrid>
+      <w:tr>
+        <w:trPr>
+          <w:cantSplit/>
+          <w:tblHeader/>
+        </w:trPr>
+        <w:tc>
+          <w:tcPr>
+            <w:tcW w:w="1800" w:type="dxa"/>
+            <w:shd w:val="clear" w:color="auto" w:fill="2E74B5"/>
+            <w:tcMar>
+              <w:top w:w="60" w:type="dxa"/>
+              <w:left w:w="100" w:type="dxa"/>
+              <w:bottom w:w="60" w:type="dxa"/>
+              <w:right w:w="100" w:type="dxa"/>
+            </w:tcMar>
+          </w:tcPr>
+          <w:p>
+            <w:pPr>
+              <w:spacing w:line="264" w:lineRule="auto"/>
+            </w:pPr>
+            <w:r>
+              <w:rPr>
+                <w:b/>
+                <w:bCs/>
+                <w:color w:val="FFFFFF"/>
+                <w:sz w:val="19"/>
+                <w:szCs w:val="19"/>
+              </w:rPr>
+              <w:t>Message</w:t>
+            </w:r>
+          </w:p>
+        </w:tc>
+        <w:tc>
+          <w:tcPr>
+            <w:tcW w:w="7906" w:type="dxa"/>
+            <w:shd w:val="clear" w:color="auto" w:fill="2E74B5"/>
+            <w:tcMar>
+              <w:top w:w="60" w:type="dxa"/>
+              <w:left w:w="100" w:type="dxa"/>
+              <w:bottom w:w="60" w:type="dxa"/>
+              <w:right w:w="100" w:type="dxa"/>
+            </w:tcMar>
+          </w:tcPr>
+          <w:p>
+            <w:pPr>
+              <w:spacing w:line="264" w:lineRule="auto"/>
+            </w:pPr>
+            <w:r>
+              <w:rPr>
+                <w:b/>
+                <w:bCs/>
+                <w:color w:val="FFFFFF"/>
+                <w:sz w:val="19"/>
+                <w:szCs w:val="19"/>
+              </w:rPr>
+              <w:t>SHA-1 hash</w:t>
+            </w:r>
+          </w:p>
+        </w:tc>
+      </w:tr>
+      <w:tr>
+        <w:trPr>
+          <w:cantSplit/>
+        </w:trPr>
+        <w:tc>
+          <w:tcPr>
+            <w:tcW w:w="1800" w:type="dxa"/>
+            <w:tcMar>
+              <w:top w:w="60" w:type="dxa"/>
+              <w:left w:w="100" w:type="dxa"/>
+              <w:bottom w:w="60" w:type="dxa"/>
+              <w:right w:w="100" w:type="dxa"/>
+            </w:tcMar>
+          </w:tcPr>
+          <w:p>
+            <w:pPr>
+              <w:spacing w:line="264" w:lineRule="auto"/>
+            </w:pPr>
+            <w:r>
+              <w:rPr>
+                <w:rFonts w:ascii="Consolas" w:hAnsi="Consolas" w:cs="Consolas"/>
+                <w:color w:val="C7254E"/>
+                <w:sz w:val="17"/>
+                <w:szCs w:val="17"/>
+                <w:shd w:val="clear" w:color="auto" w:fill="F4F4F4"/>
+              </w:rPr>
+              <w:t>Testing</w:t>
+            </w:r>
+          </w:p>
+        </w:tc>
+        <w:tc>
+          <w:tcPr>
+            <w:tcW w:w="7906" w:type="dxa"/>
+            <w:tcMar>
+              <w:top w:w="60" w:type="dxa"/>
+              <w:left w:w="100" w:type="dxa"/>
+              <w:bottom w:w="60" w:type="dxa"/>
+              <w:right w:w="100" w:type="dxa"/>
+            </w:tcMar>
+          </w:tcPr>
+          <w:p>
+            <w:pPr>
+              <w:spacing w:line="264" w:lineRule="auto"/>
+            </w:pPr>
+            <w:r>
+              <w:rPr>
+                <w:rFonts w:ascii="Consolas" w:hAnsi="Consolas" w:cs="Consolas"/>
+                <w:color w:val="C7254E"/>
+                <w:sz w:val="17"/>
+                <w:szCs w:val="17"/>
+                <w:shd w:val="clear" w:color="auto" w:fill="F4F4F4"/>
+              </w:rPr>
+              <w:t>0820b32b206b7352858e8903a838ed14319acdfd</w:t>
+            </w:r>
+          </w:p>
+        </w:tc>
+      </w:tr>
+      <w:tr>
+        <w:trPr>
+          <w:cantSplit/>
+        </w:trPr>
+        <w:tc>
+          <w:tcPr>
+            <w:tcW w:w="1800" w:type="dxa"/>
+            <w:shd w:val="clear" w:color="auto" w:fill="F3F7FB"/>
+            <w:tcMar>
+              <w:top w:w="60" w:type="dxa"/>
+              <w:left w:w="100" w:type="dxa"/>
+              <w:bottom w:w="60" w:type="dxa"/>
+              <w:right w:w="100" w:type="dxa"/>
+            </w:tcMar>
+          </w:tcPr>
+          <w:p>
+            <w:pPr>
+              <w:spacing w:line="264" w:lineRule="auto"/>
+            </w:pPr>
+            <w:r>
+              <w:rPr>
+                <w:rFonts w:ascii="Consolas" w:hAnsi="Consolas" w:cs="Consolas"/>
+                <w:color w:val="C7254E"/>
+                <w:sz w:val="17"/>
+                <w:szCs w:val="17"/>
+                <w:shd w:val="clear" w:color="auto" w:fill="F4F4F4"/>
+              </w:rPr>
+              <w:t>Tasting</w:t>
+            </w:r>
+          </w:p>
+        </w:tc>
+        <w:tc>
+          <w:tcPr>
+            <w:tcW w:w="7906" w:type="dxa"/>
+            <w:shd w:val="clear" w:color="auto" w:fill="F3F7FB"/>
+            <w:tcMar>
+              <w:top w:w="60" w:type="dxa"/>
+              <w:left w:w="100" w:type="dxa"/>
+              <w:bottom w:w="60" w:type="dxa"/>
+              <w:right w:w="100" w:type="dxa"/>
+            </w:tcMar>
+          </w:tcPr>
+          <w:p>
+            <w:pPr>
+              <w:spacing w:line="264" w:lineRule="auto"/>
+            </w:pPr>
+            <w:r>
+              <w:rPr>
+                <w:rFonts w:ascii="Consolas" w:hAnsi="Consolas" w:cs="Consolas"/>
+                <w:color w:val="C7254E"/>
+                <w:sz w:val="17"/>
+                <w:szCs w:val="17"/>
+                <w:shd w:val="clear" w:color="auto" w:fill="F4F4F4"/>
+              </w:rPr>
+              <w:t>ea1e43d415e84b553d0625a9ac75af4ea2a27fe9</w:t>
+            </w:r>
+          </w:p>
+        </w:tc>
+      </w:tr>
+    </w:tbl>
+    <w:p>
+      <w:pPr>
+        <w:spacing w:after="0" w:line="264" w:lineRule="auto"/>
+      </w:pPr>
+    </w:p>
+    <w:p>
+      <w:pPr>
+        <w:spacing w:after="120" w:line="264" w:lineRule="auto"/>
+      </w:pPr>
+      <w:r>
+        <w:t xml:space="preserve">So if Board B works out the hash of the message it received and gets the same answer as Board A, the message is almost certainly unchanged. If the two hashes are different, something was damaged on the way.</w:t>
+      </w:r>
+    </w:p>
+    <w:p>
+      <w:pPr>
+        <w:keepNext/>
+        <w:spacing w:after="40" w:line="264" w:lineRule="auto"/>
+      </w:pPr>
+      <w:r>
+        <w:rPr>
+          <w:b/>
+          <w:bCs/>
+          <w:color w:val="595959"/>
+          <w:sz w:val="18"/>
+          <w:szCs w:val="18"/>
+        </w:rPr>
+        <w:t>What Board A sends</w:t>
+      </w:r>
+    </w:p>
+    <w:tbl>
+      <w:tblPr>
+        <w:tblW w:w="9706" w:type="dxa"/>
+        <w:tblLayout w:type="fixed"/>
+        <w:tblLook w:val="04A0" w:firstRow="1" w:lastRow="0" w:firstColumn="1" w:lastColumn="0" w:noHBand="0" w:noVBand="1"/>
+      </w:tblPr>
+      <w:tblGrid>
+        <w:gridCol w:w="2200"/>
+        <w:gridCol w:w="900"/>
+        <w:gridCol w:w="4806"/>
+        <w:gridCol w:w="1800"/>
+      </w:tblGrid>
+      <w:tr>
+        <w:trPr>
+          <w:cantSplit/>
+        </w:trPr>
+        <w:tc>
+          <w:tcPr>
+            <w:tcW w:w="2200" w:type="dxa"/>
+            <w:tcBorders>
+              <w:top w:val="single" w:sz="12" w:space="0" w:color="FFFFFF"/>
+              <w:left w:val="single" w:sz="12" w:space="0" w:color="FFFFFF"/>
+              <w:bottom w:val="single" w:sz="12" w:space="0" w:color="FFFFFF"/>
+              <w:right w:val="single" w:sz="12" w:space="0" w:color="FFFFFF"/>
+            </w:tcBorders>
+            <w:shd w:val="clear" w:color="auto" w:fill="2E75B6"/>
+            <w:tcMar>
+              <w:top w:w="90" w:type="dxa"/>
+              <w:left w:w="40" w:type="dxa"/>
+              <w:bottom w:w="90" w:type="dxa"/>
+              <w:right w:w="40" w:type="dxa"/>
+            </w:tcMar>
+          </w:tcPr>
+          <w:p>
+            <w:pPr>
+              <w:keepNext/>
+              <w:spacing w:line="264" w:lineRule="auto"/>
+              <w:jc w:val="center"/>
+            </w:pPr>
+            <w:r>
+              <w:rPr>
+                <w:rFonts w:ascii="Consolas" w:hAnsi="Consolas" w:cs="Consolas"/>
+                <w:b/>
+                <w:bCs/>
+                <w:color w:val="FFFFFF"/>
+                <w:sz w:val="20"/>
+                <w:szCs w:val="20"/>
+              </w:rPr>
+              <w:t>Testing</w:t>
+            </w:r>
+          </w:p>
+        </w:tc>
+        <w:tc>
+          <w:tcPr>
+            <w:tcW w:w="900" w:type="dxa"/>
+            <w:tcBorders>
+              <w:top w:val="single" w:sz="12" w:space="0" w:color="FFFFFF"/>
+              <w:left w:val="single" w:sz="12" w:space="0" w:color="FFFFFF"/>
+              <w:bottom w:val="single" w:sz="12" w:space="0" w:color="FFFFFF"/>
+              <w:right w:val="single" w:sz="12" w:space="0" w:color="FFFFFF"/>
+            </w:tcBorders>
+            <w:shd w:val="clear" w:color="auto" w:fill="7F7F7F"/>
+            <w:tcMar>
+              <w:top w:w="90" w:type="dxa"/>
+              <w:left w:w="40" w:type="dxa"/>
+              <w:bottom w:w="90" w:type="dxa"/>
+              <w:right w:w="40" w:type="dxa"/>
+            </w:tcMar>
+          </w:tcPr>
+          <w:p>
+            <w:pPr>
+              <w:keepNext/>
+              <w:spacing w:line="264" w:lineRule="auto"/>
+              <w:jc w:val="center"/>
+            </w:pPr>
+            <w:r>
+              <w:rPr>
+                <w:rFonts w:ascii="Consolas" w:hAnsi="Consolas" w:cs="Consolas"/>
+                <w:b/>
+                <w:bCs/>
+                <w:color w:val="FFFFFF"/>
+                <w:sz w:val="20"/>
+                <w:szCs w:val="20"/>
+              </w:rPr>
+              <w:t>|</w:t>
+            </w:r>
+          </w:p>
+        </w:tc>
+        <w:tc>
+          <w:tcPr>
+            <w:tcW w:w="4806" w:type="dxa"/>
+            <w:tcBorders>
+              <w:top w:val="single" w:sz="12" w:space="0" w:color="FFFFFF"/>
+              <w:left w:val="single" w:sz="12" w:space="0" w:color="FFFFFF"/>
+              <w:bottom w:val="single" w:sz="12" w:space="0" w:color="FFFFFF"/>
+              <w:right w:val="single" w:sz="12" w:space="0" w:color="FFFFFF"/>
+            </w:tcBorders>
+            <w:shd w:val="clear" w:color="auto" w:fill="7030A0"/>
+            <w:tcMar>
+              <w:top w:w="90" w:type="dxa"/>
+              <w:left w:w="40" w:type="dxa"/>
+              <w:bottom w:w="90" w:type="dxa"/>
+              <w:right w:w="40" w:type="dxa"/>
+            </w:tcMar>
+          </w:tcPr>
+          <w:p>
+            <w:pPr>
+              <w:keepNext/>
+              <w:spacing w:line="264" w:lineRule="auto"/>
+              <w:jc w:val="center"/>
+            </w:pPr>
+            <w:r>
+              <w:rPr>
+                <w:rFonts w:ascii="Consolas" w:hAnsi="Consolas" w:cs="Consolas"/>
+                <w:b/>
+                <w:bCs/>
+                <w:color w:val="FFFFFF"/>
+                <w:sz w:val="20"/>
+                <w:szCs w:val="20"/>
+              </w:rPr>
+              <w:t>0820b32b…319acdfd</w:t>
+            </w:r>
+          </w:p>
+        </w:tc>
+        <w:tc>
+          <w:tcPr>
+            <w:tcW w:w="1800" w:type="dxa"/>
+            <w:tcBorders>
+              <w:top w:val="single" w:sz="12" w:space="0" w:color="FFFFFF"/>
+              <w:left w:val="single" w:sz="12" w:space="0" w:color="FFFFFF"/>
+              <w:bottom w:val="single" w:sz="12" w:space="0" w:color="FFFFFF"/>
+              <w:right w:val="single" w:sz="12" w:space="0" w:color="FFFFFF"/>
+            </w:tcBorders>
+            <w:shd w:val="clear" w:color="auto" w:fill="548235"/>
+            <w:tcMar>
+              <w:top w:w="90" w:type="dxa"/>
+              <w:left w:w="40" w:type="dxa"/>
+              <w:bottom w:w="90" w:type="dxa"/>
+              <w:right w:w="40" w:type="dxa"/>
+            </w:tcMar>
+          </w:tcPr>
+          <w:p>
+            <w:pPr>
+              <w:keepNext/>
+              <w:spacing w:line="264" w:lineRule="auto"/>
+              <w:jc w:val="center"/>
+            </w:pPr>
+            <w:r>
+              <w:rPr>
+                <w:rFonts w:ascii="Consolas" w:hAnsi="Consolas" w:cs="Consolas"/>
+                <w:b/>
+                <w:bCs/>
+                <w:color w:val="FFFFFF"/>
+                <w:sz w:val="20"/>
+                <w:szCs w:val="20"/>
+              </w:rPr>
+              <w:t>\n</w:t>
+            </w:r>
+          </w:p>
+        </w:tc>
+      </w:tr>
+      <w:tr>
+        <w:trPr>
+          <w:cantSplit/>
+        </w:trPr>
+        <w:tc>
+          <w:tcPr>
+            <w:tcW w:w="2200" w:type="dxa"/>
+            <w:tcMar>
+              <w:top w:w="30" w:type="dxa"/>
+              <w:left w:w="20" w:type="dxa"/>
+              <w:bottom w:w="30" w:type="dxa"/>
+              <w:right w:w="20" w:type="dxa"/>
+            </w:tcMar>
+          </w:tcPr>
+          <w:p>
+            <w:pPr>
+              <w:spacing w:line="264" w:lineRule="auto"/>
+              <w:jc w:val="center"/>
+            </w:pPr>
+            <w:r>
+              <w:rPr>
+                <w:color w:val="595959"/>
+                <w:sz w:val="16"/>
+                <w:szCs w:val="16"/>
+              </w:rPr>
+              <w:t>message (any length)</w:t>
+            </w:r>
+          </w:p>
+        </w:tc>
+        <w:tc>
+          <w:tcPr>
+            <w:tcW w:w="900" w:type="dxa"/>
+            <w:tcMar>
+              <w:top w:w="30" w:type="dxa"/>
+              <w:left w:w="20" w:type="dxa"/>
+              <w:bottom w:w="30" w:type="dxa"/>
+              <w:right w:w="20" w:type="dxa"/>
+            </w:tcMar>
+          </w:tcPr>
+          <w:p>
+            <w:pPr>
+              <w:spacing w:line="264" w:lineRule="auto"/>
+              <w:jc w:val="center"/>
+            </w:pPr>
+            <w:r>
+              <w:rPr>
+                <w:color w:val="595959"/>
+                <w:sz w:val="16"/>
+                <w:szCs w:val="16"/>
+              </w:rPr>
+              <w:t>separator</w:t>
+            </w:r>
+          </w:p>
+        </w:tc>
+        <w:tc>
+          <w:tcPr>
+            <w:tcW w:w="4806" w:type="dxa"/>
+            <w:tcMar>
+              <w:top w:w="30" w:type="dxa"/>
+              <w:left w:w="20" w:type="dxa"/>
+              <w:bottom w:w="30" w:type="dxa"/>
+              <w:right w:w="20" w:type="dxa"/>
+            </w:tcMar>
+          </w:tcPr>
+          <w:p>
+            <w:pPr>
+              <w:spacing w:line="264" w:lineRule="auto"/>
+              <w:jc w:val="center"/>
+            </w:pPr>
+            <w:r>
+              <w:rPr>
+                <w:color w:val="595959"/>
+                <w:sz w:val="16"/>
+                <w:szCs w:val="16"/>
+              </w:rPr>
+              <w:t>SHA-1 hash: 40 hex characters</w:t>
+            </w:r>
+          </w:p>
+        </w:tc>
+        <w:tc>
+          <w:tcPr>
+            <w:tcW w:w="1800" w:type="dxa"/>
+            <w:tcMar>
+              <w:top w:w="30" w:type="dxa"/>
+              <w:left w:w="20" w:type="dxa"/>
+              <w:bottom w:w="30" w:type="dxa"/>
+              <w:right w:w="20" w:type="dxa"/>
+            </w:tcMar>
+          </w:tcPr>
+          <w:p>
+            <w:pPr>
+              <w:spacing w:line="264" w:lineRule="auto"/>
+              <w:jc w:val="center"/>
+            </w:pPr>
+            <w:r>
+              <w:rPr>
+                <w:color w:val="595959"/>
+                <w:sz w:val="16"/>
+                <w:szCs w:val="16"/>
+              </w:rPr>
+              <w:t>end of frame</w:t>
+            </w:r>
+          </w:p>
+        </w:tc>
+      </w:tr>
+    </w:tbl>
+    <w:p>
+      <w:pPr>
+        <w:spacing w:after="0" w:line="264" w:lineRule="auto"/>
+      </w:pPr>
+    </w:p>
+    <w:p>
+      <w:pPr>
+        <w:pStyle w:val="Heading2"/>
+        <w:keepNext/>
+        <w:spacing w:before="240" w:after="80"/>
+      </w:pPr>
+      <w:r>
+        <w:rPr>
+          <w:b/>
+          <w:bCs/>
+        </w:rPr>
+        <w:t>What happens</w:t>
+      </w:r>
+    </w:p>
+    <w:tbl>
+      <w:tblPr>
+        <w:tblW w:w="9706" w:type="dxa"/>
+        <w:tblLayout w:type="fixed"/>
+        <w:tblLook w:val="04A0" w:firstRow="1" w:lastRow="0" w:firstColumn="1" w:lastColumn="0" w:noHBand="0" w:noVBand="1"/>
+      </w:tblPr>
+      <w:tblGrid>
+        <w:gridCol w:w="9706"/>
+      </w:tblGrid>
+      <w:tr>
+        <w:trPr>
+          <w:cantSplit/>
+        </w:trPr>
+        <w:tc>
+          <w:tcPr>
+            <w:tcW w:w="9706" w:type="dxa"/>
+            <w:tcBorders>
+              <w:top w:val="nil"/>
+              <w:left w:val="single" w:sz="24" w:space="0" w:color="2E7D32"/>
+              <w:bottom w:val="nil"/>
+              <w:right w:val="nil"/>
+            </w:tcBorders>
+            <w:shd w:val="clear" w:color="auto" w:fill="EAF5EA"/>
+            <w:tcMar>
+              <w:top w:w="100" w:type="dxa"/>
+              <w:left w:w="180" w:type="dxa"/>
+              <w:bottom w:w="60" w:type="dxa"/>
+              <w:right w:w="160" w:type="dxa"/>
+            </w:tcMar>
+          </w:tcPr>
+          <w:p>
+            <w:pPr>
+              <w:keepNext/>
+              <w:spacing w:after="60" w:line="264" w:lineRule="auto"/>
+            </w:pPr>
+            <w:r>
+              <w:rPr>
+                <w:b/>
+                <w:bCs/>
+                <w:color w:val="2E7D32"/>
+              </w:rPr>
+              <w:t xml:space="preserve">Code</w:t>
+            </w:r>
+          </w:p>
+          <w:p>
+            <w:pPr>
+              <w:spacing w:after="60" w:line="264" w:lineRule="auto"/>
+            </w:pPr>
+            <w:r>
+              <w:t xml:space="preserve">Upload </w:t>
+            </w:r>
+            <w:r>
+              <w:rPr>
+                <w:rFonts w:ascii="Consolas" w:hAnsi="Consolas" w:cs="Consolas"/>
+                <w:color w:val="C7254E"/>
+                <w:sz w:val="20"/>
+                <w:szCs w:val="20"/>
+                <w:shd w:val="clear" w:color="auto" w:fill="F4F4F4"/>
+              </w:rPr>
+              <w:t xml:space="preserve">Task4_Sender</w:t>
+            </w:r>
+            <w:r>
+              <w:t xml:space="preserve"> to Board A and </w:t>
+            </w:r>
+            <w:r>
+              <w:rPr>
+                <w:rFonts w:ascii="Consolas" w:hAnsi="Consolas" w:cs="Consolas"/>
+                <w:color w:val="C7254E"/>
+                <w:sz w:val="20"/>
+                <w:szCs w:val="20"/>
+                <w:shd w:val="clear" w:color="auto" w:fill="F4F4F4"/>
+              </w:rPr>
+              <w:t xml:space="preserve">Task4_Receiver</w:t>
+            </w:r>
+            <w:r>
+              <w:t xml:space="preserve"> to Board B, both from your display’s folder. The SHA-1 code is already at the bottom of both sketches: you do not need to change it.</w:t>
+            </w:r>
+          </w:p>
+        </w:tc>
+      </w:tr>
+    </w:tbl>
+    <w:p>
+      <w:pPr>
+        <w:spacing w:after="0" w:line="264" w:lineRule="auto"/>
+      </w:pPr>
+    </w:p>
+    <w:p>
+      <w:pPr>
+        <w:spacing w:after="120" w:line="264" w:lineRule="auto"/>
+      </w:pPr>
+      <w:r>
+        <w:t xml:space="preserve">Every 2 seconds Board A works out the hash of the next message and sends the message and the hash together. Board B works out the hash of the message it received and compares the two. The LCD shows the message on the top row, and OK or FAIL with a running count (e.g. OK   3/4) on the bottom row. While you hold the button on Board A, it changes one bit of the message before sending it, but still sends the hash of the original, just like a message damaged on the wire.</w:t>
+      </w:r>
+    </w:p>
+    <w:p>
+      <w:pPr>
+        <w:pStyle w:val="Heading2"/>
+        <w:keepNext/>
+        <w:spacing w:before="240" w:after="80"/>
+      </w:pPr>
+      <w:r>
+        <w:rPr>
+          <w:b/>
+          <w:bCs/>
+        </w:rPr>
+        <w:t>Task 4 questions</w:t>
+      </w:r>
+    </w:p>
+    <w:p>
+      <w:pPr>
+        <w:pStyle w:val="Heading3"/>
+        <w:keepNext/>
+        <w:spacing w:before="180" w:after="60"/>
+      </w:pPr>
+      <w:r>
+        <w:rPr>
+          <w:b/>
+          <w:bCs/>
+        </w:rPr>
+        <w:t>4a  Run it</w:t>
+      </w:r>
+    </w:p>
+    <w:p>
+      <w:pPr>
+        <w:spacing w:after="120" w:line="264" w:lineRule="auto"/>
+      </w:pPr>
+      <w:r>
+        <w:t xml:space="preserve">Upload both sketches and run them. </w:t>
+      </w:r>
+      <w:r>
+        <w:rPr>
+          <w:b/>
+          <w:bCs/>
+        </w:rPr>
+        <w:t xml:space="preserve">(record)</w:t>
+      </w:r>
+      <w:r>
+        <w:t xml:space="preserve"> Paste one result from Board B’s Serial Monitor. Every message should pass:</w:t>
+      </w:r>
+    </w:p>
+    <w:p>
+      <w:pPr>
+        <w:keepNext/>
+        <w:spacing w:after="40" w:line="264" w:lineRule="auto"/>
+      </w:pPr>
+      <w:r>
+        <w:rPr>
+          <w:b/>
+          <w:bCs/>
+          <w:color w:val="595959"/>
+          <w:sz w:val="18"/>
+          <w:szCs w:val="18"/>
+        </w:rPr>
+        <w:t>Board B Serial Monitor</w:t>
+      </w:r>
+    </w:p>
+    <w:tbl>
+      <w:tblPr>
+        <w:tblW w:w="9706" w:type="dxa"/>
+        <w:tblBorders>
+          <w:top w:val="single" w:sz="4" w:space="0" w:color="BFBFBF"/>
+          <w:left w:val="single" w:sz="4" w:space="0" w:color="BFBFBF"/>
+          <w:bottom w:val="single" w:sz="4" w:space="0" w:color="BFBFBF"/>
+          <w:right w:val="single" w:sz="4" w:space="0" w:color="BFBFBF"/>
+        </w:tblBorders>
+        <w:tblLayout w:type="fixed"/>
+        <w:tblLook w:val="04A0" w:firstRow="1" w:lastRow="0" w:firstColumn="1" w:lastColumn="0" w:noHBand="0" w:noVBand="1"/>
+      </w:tblPr>
+      <w:tblGrid>
+        <w:gridCol w:w="9706"/>
+      </w:tblGrid>
+      <w:tr>
+        <w:trPr>
+          <w:cantSplit/>
+        </w:trPr>
+        <w:tc>
+          <w:tcPr>
+            <w:tcW w:w="9706" w:type="dxa"/>
+            <w:shd w:val="clear" w:color="auto" w:fill="F2F2F2"/>
+            <w:tcMar>
+              <w:top w:w="100" w:type="dxa"/>
+              <w:left w:w="160" w:type="dxa"/>
+              <w:bottom w:w="100" w:type="dxa"/>
+              <w:right w:w="160" w:type="dxa"/>
+            </w:tcMar>
+          </w:tcPr>
+          <w:p>
+            <w:r>
+              <w:rPr>
+                <w:rFonts w:ascii="Consolas" w:hAnsi="Consolas" w:cs="Consolas"/>
+                <w:color w:val="1F1F1F"/>
+                <w:sz w:val="17"/>
+                <w:szCs w:val="17"/>
+              </w:rPr>
+              <w:t xml:space="preserve">Message:  Testing</w:t>
+            </w:r>
+          </w:p>
+          <w:p>
+            <w:r>
+              <w:rPr>
+                <w:rFonts w:ascii="Consolas" w:hAnsi="Consolas" w:cs="Consolas"/>
+                <w:color w:val="1F1F1F"/>
+                <w:sz w:val="17"/>
+                <w:szCs w:val="17"/>
+              </w:rPr>
+              <w:t xml:space="preserve">Received: 0820b32b206b7352858e8903a838ed14319acdfd</w:t>
+            </w:r>
+          </w:p>
+          <w:p>
+            <w:r>
+              <w:rPr>
+                <w:rFonts w:ascii="Consolas" w:hAnsi="Consolas" w:cs="Consolas"/>
+                <w:color w:val="1F1F1F"/>
+                <w:sz w:val="17"/>
+                <w:szCs w:val="17"/>
+              </w:rPr>
+              <w:t xml:space="preserve">Computed: 0820b32b206b7352858e8903a838ed14319acdfd</w:t>
+            </w:r>
+          </w:p>
+          <w:p>
+            <w:r>
+              <w:rPr>
+                <w:rFonts w:ascii="Consolas" w:hAnsi="Consolas" w:cs="Consolas"/>
+                <w:color w:val="1F1F1F"/>
+                <w:sz w:val="17"/>
+                <w:szCs w:val="17"/>
+              </w:rPr>
+              <w:t xml:space="preserve">Result: OK</w:t>
+            </w:r>
+          </w:p>
+        </w:tc>
+      </w:tr>
+    </w:tbl>
+    <w:p>
+      <w:pPr>
+        <w:spacing w:after="0" w:line="264" w:lineRule="auto"/>
+      </w:pPr>
+    </w:p>
+    <w:p>
+      <w:pPr>
+        <w:pStyle w:val="Heading3"/>
+        <w:keepNext/>
+        <w:spacing w:before="180" w:after="60"/>
+      </w:pPr>
+      <w:r>
+        <w:rPr>
+          <w:b/>
+          <w:bCs/>
+        </w:rPr>
+        <w:t>4b  Damage a message</w:t>
+      </w:r>
+    </w:p>
+    <w:p>
+      <w:pPr>
+        <w:spacing w:after="120" w:line="264" w:lineRule="auto"/>
+      </w:pPr>
+      <w:r>
+        <w:t xml:space="preserve">Hold the button on Board A while a message is sent. </w:t>
+      </w:r>
+      <w:r>
+        <w:rPr>
+          <w:b/>
+          <w:bCs/>
+        </w:rPr>
+        <w:t xml:space="preserve">(record)</w:t>
+      </w:r>
+      <w:r>
+        <w:t xml:space="preserve"> Paste the FAIL result from Board B and the matching line from Board A. They should look like this:</w:t>
+      </w:r>
+    </w:p>
+    <w:p>
+      <w:pPr>
+        <w:keepNext/>
+        <w:spacing w:after="40" w:line="264" w:lineRule="auto"/>
+      </w:pPr>
+      <w:r>
+        <w:rPr>
+          <w:b/>
+          <w:bCs/>
+          <w:color w:val="595959"/>
+          <w:sz w:val="18"/>
+          <w:szCs w:val="18"/>
+        </w:rPr>
+        <w:t>Board A Serial Monitor (button held)</w:t>
+      </w:r>
+    </w:p>
+    <w:tbl>
+      <w:tblPr>
+        <w:tblW w:w="9706" w:type="dxa"/>
+        <w:tblBorders>
+          <w:top w:val="single" w:sz="4" w:space="0" w:color="BFBFBF"/>
+          <w:left w:val="single" w:sz="4" w:space="0" w:color="BFBFBF"/>
+          <w:bottom w:val="single" w:sz="4" w:space="0" w:color="BFBFBF"/>
+          <w:right w:val="single" w:sz="4" w:space="0" w:color="BFBFBF"/>
+        </w:tblBorders>
+        <w:tblLayout w:type="fixed"/>
+        <w:tblLook w:val="04A0" w:firstRow="1" w:lastRow="0" w:firstColumn="1" w:lastColumn="0" w:noHBand="0" w:noVBand="1"/>
+      </w:tblPr>
+      <w:tblGrid>
+        <w:gridCol w:w="9706"/>
+      </w:tblGrid>
+      <w:tr>
+        <w:trPr>
+          <w:cantSplit/>
+        </w:trPr>
+        <w:tc>
+          <w:tcPr>
+            <w:tcW w:w="9706" w:type="dxa"/>
+            <w:shd w:val="clear" w:color="auto" w:fill="F2F2F2"/>
+            <w:tcMar>
+              <w:top w:w="100" w:type="dxa"/>
+              <w:left w:w="160" w:type="dxa"/>
+              <w:bottom w:w="100" w:type="dxa"/>
+              <w:right w:w="160" w:type="dxa"/>
+            </w:tcMar>
+          </w:tcPr>
+          <w:p>
+            <w:r>
+              <w:rPr>
+                <w:rFonts w:ascii="Consolas" w:hAnsi="Consolas" w:cs="Consolas"/>
+                <w:color w:val="1F1F1F"/>
+                <w:sz w:val="17"/>
+                <w:szCs w:val="17"/>
+              </w:rPr>
+              <w:t xml:space="preserve">Sent (TAMPERED): Dmbedded|0fd17b94c9576216ee0a47001e3fdbb1920a1f50</w:t>
+            </w:r>
+          </w:p>
+        </w:tc>
+      </w:tr>
+    </w:tbl>
+    <w:p>
+      <w:pPr>
+        <w:spacing w:after="0" w:line="264" w:lineRule="auto"/>
+      </w:pPr>
+    </w:p>
+    <w:p>
+      <w:pPr>
+        <w:keepNext/>
+        <w:spacing w:after="40" w:line="264" w:lineRule="auto"/>
+      </w:pPr>
+      <w:r>
+        <w:rPr>
+          <w:b/>
+          <w:bCs/>
+          <w:color w:val="595959"/>
+          <w:sz w:val="18"/>
+          <w:szCs w:val="18"/>
+        </w:rPr>
+        <w:t>Board B Serial Monitor</w:t>
+      </w:r>
+    </w:p>
+    <w:tbl>
+      <w:tblPr>
+        <w:tblW w:w="9706" w:type="dxa"/>
+        <w:tblBorders>
+          <w:top w:val="single" w:sz="4" w:space="0" w:color="BFBFBF"/>
+          <w:left w:val="single" w:sz="4" w:space="0" w:color="BFBFBF"/>
+          <w:bottom w:val="single" w:sz="4" w:space="0" w:color="BFBFBF"/>
+          <w:right w:val="single" w:sz="4" w:space="0" w:color="BFBFBF"/>
+        </w:tblBorders>
+        <w:tblLayout w:type="fixed"/>
+        <w:tblLook w:val="04A0" w:firstRow="1" w:lastRow="0" w:firstColumn="1" w:lastColumn="0" w:noHBand="0" w:noVBand="1"/>
+      </w:tblPr>
+      <w:tblGrid>
+        <w:gridCol w:w="9706"/>
+      </w:tblGrid>
+      <w:tr>
+        <w:trPr>
+          <w:cantSplit/>
+        </w:trPr>
+        <w:tc>
+          <w:tcPr>
+            <w:tcW w:w="9706" w:type="dxa"/>
+            <w:shd w:val="clear" w:color="auto" w:fill="F2F2F2"/>
+            <w:tcMar>
+              <w:top w:w="100" w:type="dxa"/>
+              <w:left w:w="160" w:type="dxa"/>
+              <w:bottom w:w="100" w:type="dxa"/>
+              <w:right w:w="160" w:type="dxa"/>
+            </w:tcMar>
+          </w:tcPr>
+          <w:p>
+            <w:r>
+              <w:rPr>
+                <w:rFonts w:ascii="Consolas" w:hAnsi="Consolas" w:cs="Consolas"/>
+                <w:color w:val="1F1F1F"/>
+                <w:sz w:val="17"/>
+                <w:szCs w:val="17"/>
+              </w:rPr>
+              <w:t xml:space="preserve">Message:  Dmbedded</w:t>
+            </w:r>
+          </w:p>
+          <w:p>
+            <w:r>
+              <w:rPr>
+                <w:rFonts w:ascii="Consolas" w:hAnsi="Consolas" w:cs="Consolas"/>
+                <w:color w:val="1F1F1F"/>
+                <w:sz w:val="17"/>
+                <w:szCs w:val="17"/>
+              </w:rPr>
+              <w:t xml:space="preserve">Received: 0fd17b94c9576216ee0a47001e3fdbb1920a1f50</w:t>
+            </w:r>
+          </w:p>
+          <w:p>
+            <w:r>
+              <w:rPr>
+                <w:rFonts w:ascii="Consolas" w:hAnsi="Consolas" w:cs="Consolas"/>
+                <w:color w:val="1F1F1F"/>
+                <w:sz w:val="17"/>
+                <w:szCs w:val="17"/>
+              </w:rPr>
+              <w:t xml:space="preserve">Computed: 106b572c38133fff8835b5165f4d092b9042db0e</w:t>
+            </w:r>
+          </w:p>
+          <w:p>
+            <w:r>
+              <w:rPr>
+                <w:rFonts w:ascii="Consolas" w:hAnsi="Consolas" w:cs="Consolas"/>
+                <w:color w:val="1F1F1F"/>
+                <w:sz w:val="17"/>
+                <w:szCs w:val="17"/>
+              </w:rPr>
+              <w:t xml:space="preserve">Result: FAIL</w:t>
+            </w:r>
+          </w:p>
+        </w:tc>
+      </w:tr>
+    </w:tbl>
+    <w:p>
+      <w:pPr>
+        <w:spacing w:after="0" w:line="264" w:lineRule="auto"/>
+      </w:pPr>
+    </w:p>
+    <w:p>
+      <w:pPr>
+        <w:spacing w:after="120" w:line="264" w:lineRule="auto"/>
+      </w:pPr>
+      <w:r>
+        <w:t xml:space="preserve">Only one bit of one letter changed (E became D). Roughly how many of the 40 hash characters are different?</w:t>
+      </w:r>
+    </w:p>
+    <w:tbl>
+      <w:tblPr>
+        <w:tblW w:w="9706" w:type="dxa"/>
+        <w:tblBorders>
+          <w:top w:val="single" w:sz="4" w:space="0" w:color="A6A6A6"/>
+          <w:left w:val="single" w:sz="4" w:space="0" w:color="A6A6A6"/>
+          <w:bottom w:val="single" w:sz="4" w:space="0" w:color="A6A6A6"/>
+          <w:right w:val="single" w:sz="4" w:space="0" w:color="A6A6A6"/>
+        </w:tblBorders>
+        <w:tblLayout w:type="fixed"/>
+        <w:tblLook w:val="04A0" w:firstRow="1" w:lastRow="0" w:firstColumn="1" w:lastColumn="0" w:noHBand="0" w:noVBand="1"/>
+      </w:tblPr>
+      <w:tblGrid>
+        <w:gridCol w:w="9706"/>
+      </w:tblGrid>
+      <w:tr>
+        <w:trPr>
+          <w:cantSplit/>
+        </w:trPr>
+        <w:tc>
+          <w:tcPr>
+            <w:tcW w:w="9706" w:type="dxa"/>
+            <w:tcMar>
+              <w:top w:w="60" w:type="dxa"/>
+              <w:left w:w="120" w:type="dxa"/>
+              <w:bottom w:w="60" w:type="dxa"/>
+              <w:right w:w="120" w:type="dxa"/>
+            </w:tcMar>
+          </w:tcPr>
+          <w:p>
+            <w:pPr>
+              <w:spacing w:line="264" w:lineRule="auto"/>
+            </w:pPr>
+            <w:r>
+              <w:rPr>
+                <w:i/>
+                <w:iCs/>
+                <w:color w:val="7F7F7F"/>
+                <w:sz w:val="18"/>
+                <w:szCs w:val="18"/>
+              </w:rPr>
+              <w:lastRenderedPageBreak/>
+              <w:t>Your answer:</w:t>
+            </w:r>
+          </w:p>
+          <w:p>
+            <w:pPr>
+              <w:spacing w:after="200" w:line="264" w:lineRule="auto"/>
+            </w:pPr>
+          </w:p>
+          <w:p>
+            <w:pPr>
+              <w:spacing w:after="200" w:line="264" w:lineRule="auto"/>
+            </w:pPr>
+          </w:p>
+          <w:p>
+            <w:pPr>
+              <w:spacing w:after="200" w:line="264" w:lineRule="auto"/>
+            </w:pPr>
+          </w:p>
+        </w:tc>
+      </w:tr>
+    </w:tbl>
+    <w:p>
+      <w:pPr>
+        <w:spacing w:after="0" w:line="264" w:lineRule="auto"/>
+      </w:pPr>
+    </w:p>
+    <w:p>
+      <w:pPr>
+        <w:pStyle w:val="Heading3"/>
+        <w:keepNext/>
+        <w:spacing w:before="180" w:after="60"/>
+      </w:pPr>
+      <w:r>
+        <w:rPr>
+          <w:b/>
+          <w:bCs/>
+        </w:rPr>
+        <w:t>4c  Questions</w:t>
+      </w:r>
+    </w:p>
+    <w:p>
+      <w:pPr>
+        <w:spacing w:after="60" w:line="264" w:lineRule="auto"/>
+      </w:pPr>
+      <w:r>
+        <w:t xml:space="preserve">1. Can Board B fix a damaged message using the hash, or only tell that it is damaged?</w:t>
+      </w:r>
+    </w:p>
+    <w:p>
+      <w:pPr>
+        <w:spacing w:after="60" w:line="264" w:lineRule="auto"/>
+      </w:pPr>
+      <w:r>
+        <w:t xml:space="preserve">2. If the damage hits the hash instead of the message, what does Board B report? Is that the right result?</w:t>
+      </w:r>
+    </w:p>
+    <w:p>
+      <w:pPr>
+        <w:spacing w:after="120" w:line="264" w:lineRule="auto"/>
+      </w:pPr>
+      <w:r>
+        <w:t xml:space="preserve">3. Testing is 7 characters, but the line sent is 49 characters long. Why might a smaller check be better on a slow link?</w:t>
       </w:r>
     </w:p>
     <w:tbl>

</xml_diff>